<commit_message>
Align ESI submission with Methodology article type
</commit_message>
<xml_diff>
--- a/source_verified_v2/documents/ESI_20260925_Round2/Documents/ESI_Cover_Letter.docx
+++ b/source_verified_v2/documents/ESI_20260925_Round2/Documents/ESI_Cover_Letter.docx
@@ -119,7 +119,7 @@
           <w:color w:val="000000"/>
           <w:sz w:val="22"/>
         </w:rPr>
-        <w:t>We submit our manuscript entitled “Waveform Identity and Reproducible Source-Grouped Evaluation of Seismic Phase Pickers” for consideration as a Research Article in Earth Science Informatics.</w:t>
+        <w:t>We submit our manuscript entitled “Waveform Identity and Reproducible Source-Grouped Evaluation of Seismic Phase Pickers” for consideration as a Methodology Article in Earth Science Informatics.</w:t>
       </w:r>
     </w:p>
     <w:p>
@@ -133,7 +133,7 @@
           <w:rFonts w:ascii="Times New Roman" w:hAnsi="Times New Roman"/>
           <w:sz w:val="24"/>
         </w:rPr>
-        <w:t>The manuscript addresses an earth science informatics problem: tracing waveform identity and data dependencies through hierarchical learning and evaluation. We define executable workflow contracts and distinguish artifact consistency from predictive confirmation. An exhaustive local-archive audit links 2,234 retained waveforms to 1,477 sources; fresh replay covers 106 checkpoints. A subsequently verified HDF5-to-CSV utility regenerates every retained CSV byte hash, providing a tested route to reconstruct the selected inputs while leaving the historical selection decisions unresolved.</w:t>
+        <w:t>The manuscript presents an executable Earth-science informatics methodology connecting waveform identity, source-aware data lineage, grouped out-of-fold feature construction, model provenance, artifact verification and reproducible numerical evaluation. An exhaustive local-archive audit links 2,234 retained waveforms to 1,477 sources; fresh replay covers 106 checkpoints. A verified HDF5-to-CSV utility regenerates every retained CSV byte hash, providing a tested route to the selected inputs while leaving historical selection decisions unresolved.</w:t>
       </w:r>
     </w:p>
     <w:p>

</xml_diff>